<commit_message>
Present profile and bilingual CVs as Software Engineer
</commit_message>
<xml_diff>
--- a/assets/cv/Luciano_Bueno_CV_2026_EN.docx
+++ b/assets/cv/Luciano_Bueno_CV_2026_EN.docx
@@ -21,7 +21,7 @@
         <w:rPr>
           <w:lang w:val="en-US"/>
         </w:rPr>
-        <w:t>Back-end Developer | C# / .NET</w:t>
+        <w:t>Software Engineer</w:t>
       </w:r>
     </w:p>
     <w:p>
@@ -78,7 +78,7 @@
         <w:rPr>
           <w:lang w:val="en-US"/>
         </w:rPr>
-        <w:t>Developer focused on C#/.NET back-end development, with web application experience since 2022. I have worked as a contractor at IngaCode since 2023, contributing from requirements analysis through deployment and resolving production issues. I also build interfaces with Vue.js and Nuxt. My background in technical support and server administration helps me investigate issues across APIs, databases and interfaces.</w:t>
+        <w:t>Software engineer with web application experience since 2022, working with C#/.NET, Node.js, Python, React and Vue. I have worked as a contractor at IngaCode since 2023, contributing from requirements through deployment and resolving production issues. My background in technical support and server administration helps me investigate issues across APIs, databases, interfaces and infrastructure.</w:t>
       </w:r>
     </w:p>
     <w:p>
@@ -97,7 +97,7 @@
         <w:rPr>
           <w:lang w:val="en-US"/>
         </w:rPr>
-        <w:t>Back end: C#, .NET, ASP.NET Core, Entity Framework, REST APIs, microservices and the Mediator pattern.</w:t>
+        <w:t>Back end: C#/.NET, Node.js, Python, ASP.NET Core, Entity Framework, REST APIs, microservices and the Mediator pattern.</w:t>
       </w:r>
     </w:p>
     <w:p>
@@ -121,7 +121,7 @@
         <w:rPr>
           <w:lang w:val="en-US"/>
         </w:rPr>
-        <w:t>Front end: Vue.js, Nuxt, JavaScript and TypeScript; experience with React and React Native.</w:t>
+        <w:t>Front end: React, Vue.js, Nuxt, JavaScript and TypeScript; experience with React Native.</w:t>
       </w:r>
     </w:p>
     <w:p>

</xml_diff>